<commit_message>
Corrections : 300 evenements, 8 tests, pagination dans toute la doc
</commit_message>
<xml_diff>
--- a/docs/rapport_technique_puls_events.docx
+++ b/docs/rapport_technique_puls_events.docx
@@ -292,7 +292,7 @@
           <w:sz w:val="24"/>
           <w:szCs w:val="24"/>
         </w:rPr>
-        <w:t xml:space="preserve">agenda que-faire-a-paris, 100 événements, filtre temporel 12 mois.</w:t>
+        <w:t xml:space="preserve">agenda que-faire-a-paris, jusqu'à 300 événements avec pagination, filtre temporel 12 mois.</w:t>
       </w:r>
     </w:p>
     <w:p>
@@ -313,7 +313,7 @@
           <w:sz w:val="24"/>
           <w:szCs w:val="24"/>
         </w:rPr>
-        <w:t xml:space="preserve">Le script fetch_events.py collecte 100 événements via l'API Open Agenda avec filtre temporel. Il crée automatiquement le dossier data/ au premier lancement pour faciliter l'installation sur une machine vierge.</w:t>
+        <w:t xml:space="preserve">Le script fetch_events.py collecte jusqu'à 300 événements via l'API Open Agenda avec pagination (pages de 100) et filtre temporel. Il crée automatiquement le dossier data/ au premier lancement pour faciliter l'installation sur une machine vierge.</w:t>
       </w:r>
     </w:p>
     <w:p>

</xml_diff>